<commit_message>
New format after review3
</commit_message>
<xml_diff>
--- a/src/Layers/W1/BaseApp/Projects/Project/Reports/JobQuoteBody.docx
+++ b/src/Layers/W1/BaseApp/Projects/Project/Reports/JobQuoteBody.docx
@@ -7,12 +7,12 @@
         <w:tblStyle w:val="TableGrid"/>
         <w:tblW w:w="15422" w:type="dxa"/>
         <w:tblBorders>
-          <w:top w:val="none" w:sz="0" w:space="0" w:color="auto"/>
-          <w:left w:val="none" w:sz="0" w:space="0" w:color="auto"/>
-          <w:bottom w:val="none" w:sz="0" w:space="0" w:color="auto"/>
-          <w:right w:val="none" w:sz="0" w:space="0" w:color="auto"/>
-          <w:insideH w:val="none" w:sz="0" w:space="0" w:color="auto"/>
-          <w:insideV w:val="none" w:sz="0" w:space="0" w:color="auto"/>
+          <w:top w:val="none" w:color="auto" w:sz="0" w:space="0"/>
+          <w:left w:val="none" w:color="auto" w:sz="0" w:space="0"/>
+          <w:bottom w:val="none" w:color="auto" w:sz="0" w:space="0"/>
+          <w:right w:val="none" w:color="auto" w:sz="0" w:space="0"/>
+          <w:insideH w:val="none" w:color="auto" w:sz="0" w:space="0"/>
+          <w:insideV w:val="none" w:color="auto" w:sz="0" w:space="0"/>
         </w:tblBorders>
         <w:tblCellMar>
           <w:left w:w="0" w:type="dxa"/>
@@ -192,14 +192,14 @@
               <w:p>
                 <w:pPr>
                   <w:rPr>
-                    <w:rFonts w:asciiTheme="minorHAnsi" w:hAnsiTheme="minorHAnsi" w:cs="Segoe UI Semibold"/>
+                    <w:rFonts w:cs="Segoe UI Semibold" w:asciiTheme="minorHAnsi" w:hAnsiTheme="minorHAnsi"/>
                     <w:sz w:val="22"/>
                     <w:szCs w:val="22"/>
                   </w:rPr>
                 </w:pPr>
                 <w:r>
                   <w:rPr>
-                    <w:rFonts w:asciiTheme="minorHAnsi" w:hAnsiTheme="minorHAnsi" w:cs="Segoe UI Semibold"/>
+                    <w:rFonts w:cs="Segoe UI Semibold" w:asciiTheme="minorHAnsi" w:hAnsiTheme="minorHAnsi"/>
                     <w:sz w:val="22"/>
                     <w:szCs w:val="22"/>
                   </w:rPr>
@@ -216,7 +216,7 @@
           <w:p>
             <w:pPr>
               <w:rPr>
-                <w:rFonts w:asciiTheme="minorHAnsi" w:hAnsiTheme="minorHAnsi" w:cs="Segoe UI Semibold"/>
+                <w:rFonts w:cs="Segoe UI Semibold" w:asciiTheme="minorHAnsi" w:hAnsiTheme="minorHAnsi"/>
                 <w:sz w:val="22"/>
                 <w:szCs w:val="22"/>
               </w:rPr>
@@ -250,14 +250,14 @@
                 <w:pPr>
                   <w:jc w:val="right"/>
                   <w:rPr>
-                    <w:rFonts w:asciiTheme="minorHAnsi" w:hAnsiTheme="minorHAnsi" w:cs="Segoe UI Semibold"/>
+                    <w:rFonts w:cs="Segoe UI Semibold" w:asciiTheme="minorHAnsi" w:hAnsiTheme="minorHAnsi"/>
                     <w:sz w:val="22"/>
                     <w:szCs w:val="22"/>
                   </w:rPr>
                 </w:pPr>
                 <w:r>
                   <w:rPr>
-                    <w:rFonts w:asciiTheme="minorHAnsi" w:hAnsiTheme="minorHAnsi" w:cs="Segoe UI Semibold"/>
+                    <w:rFonts w:cs="Segoe UI Semibold" w:asciiTheme="minorHAnsi" w:hAnsiTheme="minorHAnsi"/>
                     <w:sz w:val="22"/>
                     <w:szCs w:val="22"/>
                   </w:rPr>
@@ -298,14 +298,14 @@
               <w:p>
                 <w:pPr>
                   <w:rPr>
-                    <w:rFonts w:asciiTheme="minorHAnsi" w:hAnsiTheme="minorHAnsi" w:cs="Segoe UI Semibold"/>
+                    <w:rFonts w:cs="Segoe UI Semibold" w:asciiTheme="minorHAnsi" w:hAnsiTheme="minorHAnsi"/>
                     <w:sz w:val="22"/>
                     <w:szCs w:val="22"/>
                   </w:rPr>
                 </w:pPr>
                 <w:r>
                   <w:rPr>
-                    <w:rFonts w:asciiTheme="minorHAnsi" w:hAnsiTheme="minorHAnsi" w:cs="Segoe UI Semibold"/>
+                    <w:rFonts w:cs="Segoe UI Semibold" w:asciiTheme="minorHAnsi" w:hAnsiTheme="minorHAnsi"/>
                     <w:sz w:val="22"/>
                     <w:szCs w:val="22"/>
                   </w:rPr>
@@ -322,7 +322,7 @@
           <w:p>
             <w:pPr>
               <w:rPr>
-                <w:rFonts w:asciiTheme="minorHAnsi" w:hAnsiTheme="minorHAnsi" w:cs="Segoe UI Semibold"/>
+                <w:rFonts w:cs="Segoe UI Semibold" w:asciiTheme="minorHAnsi" w:hAnsiTheme="minorHAnsi"/>
                 <w:sz w:val="22"/>
                 <w:szCs w:val="22"/>
               </w:rPr>
@@ -356,14 +356,14 @@
                 <w:pPr>
                   <w:jc w:val="right"/>
                   <w:rPr>
-                    <w:rFonts w:asciiTheme="minorHAnsi" w:hAnsiTheme="minorHAnsi" w:cs="Segoe UI Semibold"/>
+                    <w:rFonts w:cs="Segoe UI Semibold" w:asciiTheme="minorHAnsi" w:hAnsiTheme="minorHAnsi"/>
                     <w:sz w:val="22"/>
                     <w:szCs w:val="22"/>
                   </w:rPr>
                 </w:pPr>
                 <w:r>
                   <w:rPr>
-                    <w:rFonts w:asciiTheme="minorHAnsi" w:hAnsiTheme="minorHAnsi" w:cs="Segoe UI Semibold"/>
+                    <w:rFonts w:cs="Segoe UI Semibold" w:asciiTheme="minorHAnsi" w:hAnsiTheme="minorHAnsi"/>
                     <w:sz w:val="22"/>
                     <w:szCs w:val="22"/>
                   </w:rPr>
@@ -404,14 +404,14 @@
               <w:p>
                 <w:pPr>
                   <w:rPr>
-                    <w:rFonts w:asciiTheme="minorHAnsi" w:hAnsiTheme="minorHAnsi" w:cs="Segoe UI Semibold"/>
+                    <w:rFonts w:cs="Segoe UI Semibold" w:asciiTheme="minorHAnsi" w:hAnsiTheme="minorHAnsi"/>
                     <w:sz w:val="22"/>
                     <w:szCs w:val="22"/>
                   </w:rPr>
                 </w:pPr>
                 <w:r>
                   <w:rPr>
-                    <w:rFonts w:asciiTheme="minorHAnsi" w:hAnsiTheme="minorHAnsi" w:cs="Segoe UI Semibold"/>
+                    <w:rFonts w:cs="Segoe UI Semibold" w:asciiTheme="minorHAnsi" w:hAnsiTheme="minorHAnsi"/>
                     <w:sz w:val="22"/>
                     <w:szCs w:val="22"/>
                   </w:rPr>
@@ -428,7 +428,7 @@
           <w:p>
             <w:pPr>
               <w:rPr>
-                <w:rFonts w:asciiTheme="minorHAnsi" w:hAnsiTheme="minorHAnsi" w:cs="Segoe UI Semibold"/>
+                <w:rFonts w:cs="Segoe UI Semibold" w:asciiTheme="minorHAnsi" w:hAnsiTheme="minorHAnsi"/>
                 <w:sz w:val="22"/>
                 <w:szCs w:val="22"/>
               </w:rPr>
@@ -446,14 +446,14 @@
               </w:tabs>
               <w:jc w:val="right"/>
               <w:rPr>
-                <w:rFonts w:asciiTheme="minorHAnsi" w:hAnsiTheme="minorHAnsi" w:cs="Segoe UI Semibold"/>
+                <w:rFonts w:cs="Segoe UI Semibold" w:asciiTheme="minorHAnsi" w:hAnsiTheme="minorHAnsi"/>
                 <w:sz w:val="22"/>
                 <w:szCs w:val="22"/>
               </w:rPr>
             </w:pPr>
             <w:r>
               <w:rPr>
-                <w:rFonts w:asciiTheme="minorHAnsi" w:hAnsiTheme="minorHAnsi" w:cs="Segoe UI Semibold"/>
+                <w:rFonts w:cs="Segoe UI Semibold" w:asciiTheme="minorHAnsi" w:hAnsiTheme="minorHAnsi"/>
                 <w:sz w:val="22"/>
                 <w:szCs w:val="22"/>
               </w:rPr>
@@ -480,7 +480,7 @@
               <w:sdtContent>
                 <w:r>
                   <w:rPr>
-                    <w:rFonts w:asciiTheme="minorHAnsi" w:hAnsiTheme="minorHAnsi" w:cs="Segoe UI Semibold"/>
+                    <w:rFonts w:cs="Segoe UI Semibold" w:asciiTheme="minorHAnsi" w:hAnsiTheme="minorHAnsi"/>
                     <w:sz w:val="22"/>
                     <w:szCs w:val="22"/>
                   </w:rPr>
@@ -521,14 +521,14 @@
               <w:p>
                 <w:pPr>
                   <w:rPr>
-                    <w:rFonts w:asciiTheme="minorHAnsi" w:hAnsiTheme="minorHAnsi" w:cs="Segoe UI Semibold"/>
+                    <w:rFonts w:cs="Segoe UI Semibold" w:asciiTheme="minorHAnsi" w:hAnsiTheme="minorHAnsi"/>
                     <w:sz w:val="22"/>
                     <w:szCs w:val="22"/>
                   </w:rPr>
                 </w:pPr>
                 <w:r>
                   <w:rPr>
-                    <w:rFonts w:asciiTheme="minorHAnsi" w:hAnsiTheme="minorHAnsi" w:cs="Segoe UI Semibold"/>
+                    <w:rFonts w:cs="Segoe UI Semibold" w:asciiTheme="minorHAnsi" w:hAnsiTheme="minorHAnsi"/>
                     <w:sz w:val="22"/>
                     <w:szCs w:val="22"/>
                   </w:rPr>
@@ -545,7 +545,7 @@
           <w:p>
             <w:pPr>
               <w:rPr>
-                <w:rFonts w:asciiTheme="minorHAnsi" w:hAnsiTheme="minorHAnsi" w:cs="Segoe UI Semibold"/>
+                <w:rFonts w:cs="Segoe UI Semibold" w:asciiTheme="minorHAnsi" w:hAnsiTheme="minorHAnsi"/>
                 <w:sz w:val="22"/>
                 <w:szCs w:val="22"/>
               </w:rPr>
@@ -563,14 +563,14 @@
               </w:tabs>
               <w:jc w:val="right"/>
               <w:rPr>
-                <w:rFonts w:asciiTheme="minorHAnsi" w:hAnsiTheme="minorHAnsi" w:cs="Segoe UI Semibold"/>
+                <w:rFonts w:cs="Segoe UI Semibold" w:asciiTheme="minorHAnsi" w:hAnsiTheme="minorHAnsi"/>
                 <w:sz w:val="22"/>
                 <w:szCs w:val="22"/>
               </w:rPr>
             </w:pPr>
             <w:r>
               <w:rPr>
-                <w:rFonts w:asciiTheme="minorHAnsi" w:hAnsiTheme="minorHAnsi" w:cs="Segoe UI Semibold"/>
+                <w:rFonts w:cs="Segoe UI Semibold" w:asciiTheme="minorHAnsi" w:hAnsiTheme="minorHAnsi"/>
                 <w:sz w:val="22"/>
                 <w:szCs w:val="22"/>
               </w:rPr>
@@ -597,7 +597,7 @@
               <w:sdtContent>
                 <w:r>
                   <w:rPr>
-                    <w:rFonts w:asciiTheme="minorHAnsi" w:hAnsiTheme="minorHAnsi" w:cs="Segoe UI Semibold"/>
+                    <w:rFonts w:cs="Segoe UI Semibold" w:asciiTheme="minorHAnsi" w:hAnsiTheme="minorHAnsi"/>
                     <w:sz w:val="22"/>
                     <w:szCs w:val="22"/>
                   </w:rPr>
@@ -638,14 +638,14 @@
               <w:p>
                 <w:pPr>
                   <w:rPr>
-                    <w:rFonts w:asciiTheme="minorHAnsi" w:hAnsiTheme="minorHAnsi" w:cs="Segoe UI Semibold"/>
+                    <w:rFonts w:cs="Segoe UI Semibold" w:asciiTheme="minorHAnsi" w:hAnsiTheme="minorHAnsi"/>
                     <w:sz w:val="22"/>
                     <w:szCs w:val="22"/>
                   </w:rPr>
                 </w:pPr>
                 <w:r>
                   <w:rPr>
-                    <w:rFonts w:asciiTheme="minorHAnsi" w:hAnsiTheme="minorHAnsi" w:cs="Segoe UI Semibold"/>
+                    <w:rFonts w:cs="Segoe UI Semibold" w:asciiTheme="minorHAnsi" w:hAnsiTheme="minorHAnsi"/>
                     <w:sz w:val="22"/>
                     <w:szCs w:val="22"/>
                   </w:rPr>
@@ -662,7 +662,7 @@
           <w:p>
             <w:pPr>
               <w:rPr>
-                <w:rFonts w:asciiTheme="minorHAnsi" w:hAnsiTheme="minorHAnsi" w:cs="Segoe UI Semibold"/>
+                <w:rFonts w:cs="Segoe UI Semibold" w:asciiTheme="minorHAnsi" w:hAnsiTheme="minorHAnsi"/>
                 <w:sz w:val="22"/>
                 <w:szCs w:val="22"/>
               </w:rPr>
@@ -696,14 +696,14 @@
                 <w:pPr>
                   <w:jc w:val="right"/>
                   <w:rPr>
-                    <w:rFonts w:asciiTheme="minorHAnsi" w:hAnsiTheme="minorHAnsi" w:cs="Segoe UI Semibold"/>
+                    <w:rFonts w:cs="Segoe UI Semibold" w:asciiTheme="minorHAnsi" w:hAnsiTheme="minorHAnsi"/>
                     <w:sz w:val="22"/>
                     <w:szCs w:val="22"/>
                   </w:rPr>
                 </w:pPr>
                 <w:r>
                   <w:rPr>
-                    <w:rFonts w:asciiTheme="minorHAnsi" w:hAnsiTheme="minorHAnsi" w:cs="Segoe UI Semibold"/>
+                    <w:rFonts w:cs="Segoe UI Semibold" w:asciiTheme="minorHAnsi" w:hAnsiTheme="minorHAnsi"/>
                     <w:sz w:val="22"/>
                     <w:szCs w:val="22"/>
                   </w:rPr>
@@ -729,12 +729,12 @@
         <w:tblStyle w:val="TableGrid"/>
         <w:tblW w:w="15422" w:type="dxa"/>
         <w:tblBorders>
-          <w:top w:val="none" w:sz="0" w:space="0" w:color="auto"/>
-          <w:left w:val="none" w:sz="0" w:space="0" w:color="auto"/>
-          <w:bottom w:val="none" w:sz="0" w:space="0" w:color="auto"/>
-          <w:right w:val="none" w:sz="0" w:space="0" w:color="auto"/>
-          <w:insideH w:val="none" w:sz="0" w:space="0" w:color="auto"/>
-          <w:insideV w:val="none" w:sz="0" w:space="0" w:color="auto"/>
+          <w:top w:val="none" w:color="auto" w:sz="0" w:space="0"/>
+          <w:left w:val="none" w:color="auto" w:sz="0" w:space="0"/>
+          <w:bottom w:val="none" w:color="auto" w:sz="0" w:space="0"/>
+          <w:right w:val="none" w:color="auto" w:sz="0" w:space="0"/>
+          <w:insideH w:val="none" w:color="auto" w:sz="0" w:space="0"/>
+          <w:insideV w:val="none" w:color="auto" w:sz="0" w:space="0"/>
         </w:tblBorders>
         <w:tblLayout w:type="fixed"/>
         <w:tblCellMar>
@@ -991,7 +991,7 @@
               <w:p>
                 <w:pPr>
                   <w:rPr>
-                    <w:rFonts w:asciiTheme="minorHAnsi" w:hAnsiTheme="minorHAnsi" w:cs="Segoe UI"/>
+                    <w:rFonts w:cs="Segoe UI" w:asciiTheme="minorHAnsi" w:hAnsiTheme="minorHAnsi"/>
                     <w:color w:val="242424"/>
                     <w:sz w:val="22"/>
                     <w:szCs w:val="22"/>
@@ -1000,7 +1000,7 @@
                 <w:proofErr w:type="spellStart"/>
                 <w:r>
                   <w:rPr>
-                    <w:rFonts w:asciiTheme="minorHAnsi" w:hAnsiTheme="minorHAnsi" w:cs="Segoe UI"/>
+                    <w:rFonts w:cs="Segoe UI" w:asciiTheme="minorHAnsi" w:hAnsiTheme="minorHAnsi"/>
                     <w:color w:val="242424"/>
                     <w:sz w:val="22"/>
                     <w:szCs w:val="22"/>
@@ -1019,7 +1019,7 @@
           <w:p>
             <w:pPr>
               <w:rPr>
-                <w:rFonts w:asciiTheme="minorHAnsi" w:hAnsiTheme="minorHAnsi" w:cs="Segoe UI"/>
+                <w:rFonts w:cs="Segoe UI" w:asciiTheme="minorHAnsi" w:hAnsiTheme="minorHAnsi"/>
                 <w:color w:val="242424"/>
                 <w:sz w:val="22"/>
                 <w:szCs w:val="22"/>
@@ -1034,7 +1034,7 @@
           <w:p>
             <w:pPr>
               <w:rPr>
-                <w:rFonts w:asciiTheme="minorHAnsi" w:hAnsiTheme="minorHAnsi" w:cs="Segoe UI"/>
+                <w:rFonts w:cs="Segoe UI" w:asciiTheme="minorHAnsi" w:hAnsiTheme="minorHAnsi"/>
                 <w:color w:val="242424"/>
                 <w:sz w:val="22"/>
                 <w:szCs w:val="22"/>
@@ -1109,7 +1109,7 @@
         <w:sdt>
           <w:sdtPr>
             <w:rPr>
-              <w:rFonts w:ascii="Segoe UI Semibold" w:eastAsiaTheme="minorHAnsi" w:hAnsi="Segoe UI Semibold" w:cs="Segoe UI Semibold"/>
+              <w:rFonts w:ascii="Segoe UI Semibold" w:hAnsi="Segoe UI Semibold" w:cs="Segoe UI Semibold" w:eastAsiaTheme="minorHAnsi"/>
               <w:sz w:val="22"/>
               <w:szCs w:val="22"/>
             </w:rPr>
@@ -1130,14 +1130,14 @@
                 <w:cnfStyle w:val="001000000000" w:firstRow="0" w:lastRow="0" w:firstColumn="1" w:lastColumn="0" w:oddVBand="0" w:evenVBand="0" w:oddHBand="0" w:evenHBand="0" w:firstRowFirstColumn="0" w:firstRowLastColumn="0" w:lastRowFirstColumn="0" w:lastRowLastColumn="0"/>
                 <w:tcW w:w="1890" w:type="dxa"/>
                 <w:tcBorders>
-                  <w:bottom w:val="single" w:sz="4" w:space="0" w:color="auto"/>
+                  <w:bottom w:val="single" w:color="auto" w:sz="4" w:space="0"/>
                 </w:tcBorders>
               </w:tcPr>
               <w:p>
                 <w:pPr>
                   <w:pStyle w:val="Heading2"/>
                   <w:rPr>
-                    <w:rFonts w:ascii="Segoe UI Semibold" w:eastAsiaTheme="minorHAnsi" w:hAnsi="Segoe UI Semibold" w:cs="Segoe UI Semibold"/>
+                    <w:rFonts w:ascii="Segoe UI Semibold" w:hAnsi="Segoe UI Semibold" w:cs="Segoe UI Semibold" w:eastAsiaTheme="minorHAnsi"/>
                     <w:sz w:val="22"/>
                     <w:szCs w:val="22"/>
                   </w:rPr>
@@ -1145,7 +1145,7 @@
                 <w:proofErr w:type="spellStart"/>
                 <w:r>
                   <w:rPr>
-                    <w:rFonts w:ascii="Segoe UI Semibold" w:eastAsiaTheme="minorHAnsi" w:hAnsi="Segoe UI Semibold" w:cs="Segoe UI Semibold"/>
+                    <w:rFonts w:ascii="Segoe UI Semibold" w:hAnsi="Segoe UI Semibold" w:cs="Segoe UI Semibold" w:eastAsiaTheme="minorHAnsi"/>
                     <w:sz w:val="22"/>
                     <w:szCs w:val="22"/>
                   </w:rPr>
@@ -1179,7 +1179,7 @@
               <w:tcPr>
                 <w:tcW w:w="1890" w:type="dxa"/>
                 <w:tcBorders>
-                  <w:bottom w:val="single" w:sz="4" w:space="0" w:color="auto"/>
+                  <w:bottom w:val="single" w:color="auto" w:sz="4" w:space="0"/>
                 </w:tcBorders>
               </w:tcPr>
               <w:p>
@@ -1229,7 +1229,7 @@
               <w:tcPr>
                 <w:tcW w:w="2250" w:type="dxa"/>
                 <w:tcBorders>
-                  <w:bottom w:val="single" w:sz="4" w:space="0" w:color="auto"/>
+                  <w:bottom w:val="single" w:color="auto" w:sz="4" w:space="0"/>
                 </w:tcBorders>
               </w:tcPr>
               <w:p>
@@ -1279,7 +1279,7 @@
               <w:tcPr>
                 <w:tcW w:w="824" w:type="dxa"/>
                 <w:tcBorders>
-                  <w:bottom w:val="single" w:sz="4" w:space="0" w:color="auto"/>
+                  <w:bottom w:val="single" w:color="auto" w:sz="4" w:space="0"/>
                 </w:tcBorders>
               </w:tcPr>
               <w:p>
@@ -1329,7 +1329,7 @@
               <w:tcPr>
                 <w:tcW w:w="1713" w:type="dxa"/>
                 <w:tcBorders>
-                  <w:bottom w:val="single" w:sz="4" w:space="0" w:color="auto"/>
+                  <w:bottom w:val="single" w:color="auto" w:sz="4" w:space="0"/>
                 </w:tcBorders>
               </w:tcPr>
               <w:p>
@@ -1379,7 +1379,7 @@
               <w:tcPr>
                 <w:tcW w:w="1714" w:type="dxa"/>
                 <w:tcBorders>
-                  <w:bottom w:val="single" w:sz="4" w:space="0" w:color="auto"/>
+                  <w:bottom w:val="single" w:color="auto" w:sz="4" w:space="0"/>
                 </w:tcBorders>
               </w:tcPr>
               <w:p>
@@ -1430,7 +1430,7 @@
               <w:tcPr>
                 <w:tcW w:w="1713" w:type="dxa"/>
                 <w:tcBorders>
-                  <w:bottom w:val="single" w:sz="4" w:space="0" w:color="auto"/>
+                  <w:bottom w:val="single" w:color="auto" w:sz="4" w:space="0"/>
                 </w:tcBorders>
               </w:tcPr>
               <w:p>
@@ -1481,7 +1481,7 @@
               <w:tcPr>
                 <w:tcW w:w="1714" w:type="dxa"/>
                 <w:tcBorders>
-                  <w:bottom w:val="single" w:sz="4" w:space="0" w:color="auto"/>
+                  <w:bottom w:val="single" w:color="auto" w:sz="4" w:space="0"/>
                 </w:tcBorders>
               </w:tcPr>
               <w:p>
@@ -1532,7 +1532,7 @@
               <w:tcPr>
                 <w:tcW w:w="1714" w:type="dxa"/>
                 <w:tcBorders>
-                  <w:bottom w:val="single" w:sz="4" w:space="0" w:color="auto"/>
+                  <w:bottom w:val="single" w:color="auto" w:sz="4" w:space="0"/>
                 </w:tcBorders>
               </w:tcPr>
               <w:p>
@@ -1564,14 +1564,14 @@
       <w:tr>
         <w:trPr>
           <w:cnfStyle w:val="000000100000" w:firstRow="0" w:lastRow="0" w:firstColumn="0" w:lastColumn="0" w:oddVBand="0" w:evenVBand="0" w:oddHBand="1" w:evenHBand="0" w:firstRowFirstColumn="0" w:firstRowLastColumn="0" w:lastRowFirstColumn="0" w:lastRowLastColumn="0"/>
-          <w:trHeight w:hRule="exact" w:val="245"/>
+          <w:trHeight w:val="245" w:hRule="exact"/>
         </w:trPr>
         <w:tc>
           <w:tcPr>
             <w:cnfStyle w:val="001000000000" w:firstRow="0" w:lastRow="0" w:firstColumn="1" w:lastColumn="0" w:oddVBand="0" w:evenVBand="0" w:oddHBand="0" w:evenHBand="0" w:firstRowFirstColumn="0" w:firstRowLastColumn="0" w:lastRowFirstColumn="0" w:lastRowLastColumn="0"/>
             <w:tcW w:w="1890" w:type="dxa"/>
             <w:tcBorders>
-              <w:top w:val="single" w:sz="4" w:space="0" w:color="auto"/>
+              <w:top w:val="single" w:color="auto" w:sz="4" w:space="0"/>
             </w:tcBorders>
           </w:tcPr>
           <w:p>
@@ -1590,7 +1590,7 @@
           <w:tcPr>
             <w:tcW w:w="1890" w:type="dxa"/>
             <w:tcBorders>
-              <w:top w:val="single" w:sz="4" w:space="0" w:color="auto"/>
+              <w:top w:val="single" w:color="auto" w:sz="4" w:space="0"/>
             </w:tcBorders>
           </w:tcPr>
           <w:p>
@@ -1611,7 +1611,7 @@
           <w:tcPr>
             <w:tcW w:w="2250" w:type="dxa"/>
             <w:tcBorders>
-              <w:top w:val="single" w:sz="4" w:space="0" w:color="auto"/>
+              <w:top w:val="single" w:color="auto" w:sz="4" w:space="0"/>
             </w:tcBorders>
           </w:tcPr>
           <w:p>
@@ -1632,7 +1632,7 @@
           <w:tcPr>
             <w:tcW w:w="824" w:type="dxa"/>
             <w:tcBorders>
-              <w:top w:val="single" w:sz="4" w:space="0" w:color="auto"/>
+              <w:top w:val="single" w:color="auto" w:sz="4" w:space="0"/>
             </w:tcBorders>
           </w:tcPr>
           <w:p>
@@ -1653,7 +1653,7 @@
           <w:tcPr>
             <w:tcW w:w="1713" w:type="dxa"/>
             <w:tcBorders>
-              <w:top w:val="single" w:sz="4" w:space="0" w:color="auto"/>
+              <w:top w:val="single" w:color="auto" w:sz="4" w:space="0"/>
             </w:tcBorders>
           </w:tcPr>
           <w:p>
@@ -1674,7 +1674,7 @@
           <w:tcPr>
             <w:tcW w:w="1714" w:type="dxa"/>
             <w:tcBorders>
-              <w:top w:val="single" w:sz="4" w:space="0" w:color="auto"/>
+              <w:top w:val="single" w:color="auto" w:sz="4" w:space="0"/>
             </w:tcBorders>
           </w:tcPr>
           <w:p>
@@ -1695,7 +1695,7 @@
           <w:tcPr>
             <w:tcW w:w="1713" w:type="dxa"/>
             <w:tcBorders>
-              <w:top w:val="single" w:sz="4" w:space="0" w:color="auto"/>
+              <w:top w:val="single" w:color="auto" w:sz="4" w:space="0"/>
             </w:tcBorders>
           </w:tcPr>
           <w:p>
@@ -1716,7 +1716,7 @@
           <w:tcPr>
             <w:tcW w:w="1714" w:type="dxa"/>
             <w:tcBorders>
-              <w:top w:val="single" w:sz="4" w:space="0" w:color="auto"/>
+              <w:top w:val="single" w:color="auto" w:sz="4" w:space="0"/>
             </w:tcBorders>
           </w:tcPr>
           <w:p>
@@ -1737,7 +1737,7 @@
           <w:tcPr>
             <w:tcW w:w="1714" w:type="dxa"/>
             <w:tcBorders>
-              <w:top w:val="single" w:sz="4" w:space="0" w:color="auto"/>
+              <w:top w:val="single" w:color="auto" w:sz="4" w:space="0"/>
             </w:tcBorders>
           </w:tcPr>
           <w:p>
@@ -1758,7 +1758,7 @@
       <w:sdt>
         <w:sdtPr>
           <w:rPr>
-            <w:rFonts w:asciiTheme="minorHAnsi" w:eastAsiaTheme="minorEastAsia" w:hAnsiTheme="minorHAnsi" w:cs="Segoe UI"/>
+            <w:rFonts w:cs="Segoe UI" w:asciiTheme="minorHAnsi" w:hAnsiTheme="minorHAnsi" w:eastAsiaTheme="minorEastAsia"/>
             <w:bCs w:val="0"/>
             <w:kern w:val="2"/>
             <w:sz w:val="16"/>
@@ -1777,7 +1777,7 @@
           <w:sdt>
             <w:sdtPr>
               <w:rPr>
-                <w:rFonts w:asciiTheme="minorHAnsi" w:eastAsiaTheme="minorEastAsia" w:hAnsiTheme="minorHAnsi" w:cs="Segoe UI"/>
+                <w:rFonts w:cs="Segoe UI" w:asciiTheme="minorHAnsi" w:hAnsiTheme="minorHAnsi" w:eastAsiaTheme="minorEastAsia"/>
                 <w:bCs w:val="0"/>
                 <w:kern w:val="2"/>
                 <w:sz w:val="16"/>
@@ -1793,7 +1793,7 @@
               <w:sdt>
                 <w:sdtPr>
                   <w:rPr>
-                    <w:rFonts w:asciiTheme="minorHAnsi" w:eastAsiaTheme="minorEastAsia" w:hAnsiTheme="minorHAnsi" w:cs="Segoe UI"/>
+                    <w:rFonts w:cs="Segoe UI" w:asciiTheme="minorHAnsi" w:hAnsiTheme="minorHAnsi" w:eastAsiaTheme="minorEastAsia"/>
                     <w:bCs w:val="0"/>
                     <w:kern w:val="2"/>
                     <w:sz w:val="16"/>
@@ -1812,7 +1812,7 @@
                   <w:sdt>
                     <w:sdtPr>
                       <w:rPr>
-                        <w:rFonts w:asciiTheme="minorHAnsi" w:eastAsiaTheme="minorEastAsia" w:hAnsiTheme="minorHAnsi" w:cs="Segoe UI"/>
+                        <w:rFonts w:cs="Segoe UI" w:asciiTheme="minorHAnsi" w:hAnsiTheme="minorHAnsi" w:eastAsiaTheme="minorEastAsia"/>
                         <w:bCs w:val="0"/>
                         <w:kern w:val="2"/>
                         <w:sz w:val="16"/>
@@ -1833,7 +1833,7 @@
                         <w:sdt>
                           <w:sdtPr>
                             <w:rPr>
-                              <w:rFonts w:asciiTheme="minorHAnsi" w:eastAsiaTheme="minorEastAsia" w:hAnsiTheme="minorHAnsi" w:cs="Segoe UI"/>
+                              <w:rFonts w:cs="Segoe UI" w:asciiTheme="minorHAnsi" w:hAnsiTheme="minorHAnsi" w:eastAsiaTheme="minorEastAsia"/>
                               <w:bCs w:val="0"/>
                               <w:kern w:val="2"/>
                               <w:sz w:val="16"/>
@@ -1853,7 +1853,7 @@
                           </w:sdtPr>
                           <w:sdtEndPr>
                             <w:rPr>
-                              <w:rFonts w:ascii="Segoe UI" w:eastAsia="Aptos" w:hAnsi="Segoe UI" w:cs="Segoe UI Semibold"/>
+                              <w:rFonts w:ascii="Segoe UI" w:hAnsi="Segoe UI" w:eastAsia="Aptos" w:cs="Segoe UI Semibold"/>
                               <w:kern w:val="0"/>
                               <w:sz w:val="22"/>
                               <w:szCs w:val="22"/>
@@ -1871,7 +1871,7 @@
                               <w:p>
                                 <w:pPr>
                                   <w:rPr>
-                                    <w:rFonts w:asciiTheme="minorHAnsi" w:hAnsiTheme="minorHAnsi" w:cs="Segoe UI Semibold"/>
+                                    <w:rFonts w:cs="Segoe UI Semibold" w:asciiTheme="minorHAnsi" w:hAnsiTheme="minorHAnsi"/>
                                     <w:sz w:val="22"/>
                                     <w:szCs w:val="22"/>
                                     <w:lang w:val="en-US" w:eastAsia="en-US"/>
@@ -1880,7 +1880,7 @@
                                 <w:proofErr w:type="spellStart"/>
                                 <w:r>
                                   <w:rPr>
-                                    <w:rFonts w:asciiTheme="minorHAnsi" w:hAnsiTheme="minorHAnsi" w:cs="Segoe UI Semibold"/>
+                                    <w:rFonts w:cs="Segoe UI Semibold" w:asciiTheme="minorHAnsi" w:hAnsiTheme="minorHAnsi"/>
                                     <w:sz w:val="22"/>
                                     <w:szCs w:val="22"/>
                                     <w:lang w:val="en-US" w:eastAsia="en-US"/>
@@ -1921,7 +1921,7 @@
                                 <w:pPr>
                                   <w:cnfStyle w:val="000000010000" w:firstRow="0" w:lastRow="0" w:firstColumn="0" w:lastColumn="0" w:oddVBand="0" w:evenVBand="0" w:oddHBand="0" w:evenHBand="1" w:firstRowFirstColumn="0" w:firstRowLastColumn="0" w:lastRowFirstColumn="0" w:lastRowLastColumn="0"/>
                                   <w:rPr>
-                                    <w:rFonts w:asciiTheme="minorHAnsi" w:hAnsiTheme="minorHAnsi" w:cs="Segoe UI Semibold"/>
+                                    <w:rFonts w:cs="Segoe UI Semibold" w:asciiTheme="minorHAnsi" w:hAnsiTheme="minorHAnsi"/>
                                     <w:sz w:val="22"/>
                                     <w:szCs w:val="22"/>
                                     <w:lang w:eastAsia="en-US"/>
@@ -1929,7 +1929,7 @@
                                 </w:pPr>
                                 <w:r>
                                   <w:rPr>
-                                    <w:rFonts w:asciiTheme="minorHAnsi" w:hAnsiTheme="minorHAnsi" w:cs="Segoe UI Semibold"/>
+                                    <w:rFonts w:cs="Segoe UI Semibold" w:asciiTheme="minorHAnsi" w:hAnsiTheme="minorHAnsi"/>
                                     <w:sz w:val="22"/>
                                     <w:szCs w:val="22"/>
                                     <w:lang w:eastAsia="en-US"/>
@@ -1969,7 +1969,7 @@
                                 <w:pPr>
                                   <w:cnfStyle w:val="000000010000" w:firstRow="0" w:lastRow="0" w:firstColumn="0" w:lastColumn="0" w:oddVBand="0" w:evenVBand="0" w:oddHBand="0" w:evenHBand="1" w:firstRowFirstColumn="0" w:firstRowLastColumn="0" w:lastRowFirstColumn="0" w:lastRowLastColumn="0"/>
                                   <w:rPr>
-                                    <w:rFonts w:asciiTheme="minorHAnsi" w:hAnsiTheme="minorHAnsi" w:cs="Segoe UI Semibold"/>
+                                    <w:rFonts w:cs="Segoe UI Semibold" w:asciiTheme="minorHAnsi" w:hAnsiTheme="minorHAnsi"/>
                                     <w:sz w:val="22"/>
                                     <w:szCs w:val="22"/>
                                     <w:lang w:val="en-US" w:eastAsia="en-US"/>
@@ -1977,7 +1977,7 @@
                                 </w:pPr>
                                 <w:r>
                                   <w:rPr>
-                                    <w:rFonts w:asciiTheme="minorHAnsi" w:hAnsiTheme="minorHAnsi" w:cs="Segoe UI Semibold"/>
+                                    <w:rFonts w:cs="Segoe UI Semibold" w:asciiTheme="minorHAnsi" w:hAnsiTheme="minorHAnsi"/>
                                     <w:sz w:val="22"/>
                                     <w:szCs w:val="22"/>
                                     <w:lang w:val="en-US" w:eastAsia="en-US"/>
@@ -2016,14 +2016,14 @@
                                 <w:pPr>
                                   <w:cnfStyle w:val="000000010000" w:firstRow="0" w:lastRow="0" w:firstColumn="0" w:lastColumn="0" w:oddVBand="0" w:evenVBand="0" w:oddHBand="0" w:evenHBand="1" w:firstRowFirstColumn="0" w:firstRowLastColumn="0" w:lastRowFirstColumn="0" w:lastRowLastColumn="0"/>
                                   <w:rPr>
-                                    <w:rFonts w:asciiTheme="minorHAnsi" w:hAnsiTheme="minorHAnsi" w:cs="Segoe UI Semibold"/>
+                                    <w:rFonts w:cs="Segoe UI Semibold" w:asciiTheme="minorHAnsi" w:hAnsiTheme="minorHAnsi"/>
                                     <w:sz w:val="22"/>
                                     <w:szCs w:val="22"/>
                                   </w:rPr>
                                 </w:pPr>
                                 <w:r>
                                   <w:rPr>
-                                    <w:rFonts w:asciiTheme="minorHAnsi" w:hAnsiTheme="minorHAnsi" w:cs="Segoe UI Semibold"/>
+                                    <w:rFonts w:cs="Segoe UI Semibold" w:asciiTheme="minorHAnsi" w:hAnsiTheme="minorHAnsi"/>
                                     <w:sz w:val="22"/>
                                     <w:szCs w:val="22"/>
                                   </w:rPr>
@@ -2061,14 +2061,14 @@
                                 <w:pPr>
                                   <w:cnfStyle w:val="000000010000" w:firstRow="0" w:lastRow="0" w:firstColumn="0" w:lastColumn="0" w:oddVBand="0" w:evenVBand="0" w:oddHBand="0" w:evenHBand="1" w:firstRowFirstColumn="0" w:firstRowLastColumn="0" w:lastRowFirstColumn="0" w:lastRowLastColumn="0"/>
                                   <w:rPr>
-                                    <w:rFonts w:asciiTheme="minorHAnsi" w:hAnsiTheme="minorHAnsi" w:cs="Segoe UI Semibold"/>
+                                    <w:rFonts w:cs="Segoe UI Semibold" w:asciiTheme="minorHAnsi" w:hAnsiTheme="minorHAnsi"/>
                                     <w:sz w:val="22"/>
                                     <w:szCs w:val="22"/>
                                   </w:rPr>
                                 </w:pPr>
                                 <w:r>
                                   <w:rPr>
-                                    <w:rFonts w:asciiTheme="minorHAnsi" w:hAnsiTheme="minorHAnsi" w:cs="Segoe UI Semibold"/>
+                                    <w:rFonts w:cs="Segoe UI Semibold" w:asciiTheme="minorHAnsi" w:hAnsiTheme="minorHAnsi"/>
                                     <w:sz w:val="22"/>
                                     <w:szCs w:val="22"/>
                                   </w:rPr>
@@ -2153,7 +2153,7 @@
                                   <w:pStyle w:val="CLNumBase"/>
                                   <w:cnfStyle w:val="000000010000" w:firstRow="0" w:lastRow="0" w:firstColumn="0" w:lastColumn="0" w:oddVBand="0" w:evenVBand="0" w:oddHBand="0" w:evenHBand="1" w:firstRowFirstColumn="0" w:firstRowLastColumn="0" w:lastRowFirstColumn="0" w:lastRowLastColumn="0"/>
                                   <w:rPr>
-                                    <w:rFonts w:asciiTheme="minorHAnsi" w:hAnsiTheme="minorHAnsi" w:cs="Segoe UI Semibold"/>
+                                    <w:rFonts w:cs="Segoe UI Semibold" w:asciiTheme="minorHAnsi" w:hAnsiTheme="minorHAnsi"/>
                                     <w:sz w:val="22"/>
                                     <w:szCs w:val="22"/>
                                   </w:rPr>
@@ -2248,7 +2248,7 @@
                                   <w:jc w:val="right"/>
                                   <w:cnfStyle w:val="000000010000" w:firstRow="0" w:lastRow="0" w:firstColumn="0" w:lastColumn="0" w:oddVBand="0" w:evenVBand="0" w:oddHBand="0" w:evenHBand="1" w:firstRowFirstColumn="0" w:firstRowLastColumn="0" w:lastRowFirstColumn="0" w:lastRowLastColumn="0"/>
                                   <w:rPr>
-                                    <w:rFonts w:asciiTheme="minorHAnsi" w:hAnsiTheme="minorHAnsi" w:cs="Segoe UI Semibold"/>
+                                    <w:rFonts w:cs="Segoe UI Semibold" w:asciiTheme="minorHAnsi" w:hAnsiTheme="minorHAnsi"/>
                                     <w:sz w:val="22"/>
                                     <w:szCs w:val="22"/>
                                   </w:rPr>
@@ -2256,7 +2256,7 @@
                                 <w:proofErr w:type="spellStart"/>
                                 <w:r>
                                   <w:rPr>
-                                    <w:rFonts w:asciiTheme="minorHAnsi" w:hAnsiTheme="minorHAnsi" w:cs="Segoe UI Semibold"/>
+                                    <w:rFonts w:cs="Segoe UI Semibold" w:asciiTheme="minorHAnsi" w:hAnsiTheme="minorHAnsi"/>
                                     <w:sz w:val="22"/>
                                     <w:szCs w:val="22"/>
                                   </w:rPr>
@@ -2306,7 +2306,7 @@
         <w:sdt>
           <w:sdtPr>
             <w:rPr>
-              <w:rFonts w:ascii="Segoe UI Semibold" w:eastAsia="Times New Roman" w:hAnsi="Segoe UI Semibold" w:cs="Segoe UI Semibold"/>
+              <w:rFonts w:ascii="Segoe UI Semibold" w:hAnsi="Segoe UI Semibold" w:eastAsia="Times New Roman" w:cs="Segoe UI Semibold"/>
               <w:sz w:val="22"/>
               <w:szCs w:val="22"/>
             </w:rPr>
@@ -2327,8 +2327,8 @@
                 <w:cnfStyle w:val="001000000000" w:firstRow="0" w:lastRow="0" w:firstColumn="1" w:lastColumn="0" w:oddVBand="0" w:evenVBand="0" w:oddHBand="0" w:evenHBand="0" w:firstRowFirstColumn="0" w:firstRowLastColumn="0" w:lastRowFirstColumn="0" w:lastRowLastColumn="0"/>
                 <w:tcW w:w="4995" w:type="dxa"/>
                 <w:tcBorders>
-                  <w:top w:val="single" w:sz="4" w:space="0" w:color="000000"/>
-                  <w:bottom w:val="single" w:sz="12" w:space="0" w:color="000000"/>
+                  <w:top w:val="single" w:color="000000" w:sz="4" w:space="0"/>
+                  <w:bottom w:val="single" w:color="000000" w:sz="12" w:space="0"/>
                 </w:tcBorders>
                 <w:vAlign w:val="center"/>
               </w:tcPr>
@@ -2337,7 +2337,7 @@
                   <w:pStyle w:val="Heading2"/>
                   <w:spacing w:before="120" w:after="120" w:line="240" w:lineRule="exact"/>
                   <w:rPr>
-                    <w:rFonts w:ascii="Segoe UI Semibold" w:eastAsia="Times New Roman" w:hAnsi="Segoe UI Semibold" w:cs="Segoe UI Semibold"/>
+                    <w:rFonts w:ascii="Segoe UI Semibold" w:hAnsi="Segoe UI Semibold" w:eastAsia="Times New Roman" w:cs="Segoe UI Semibold"/>
                     <w:sz w:val="22"/>
                     <w:szCs w:val="22"/>
                   </w:rPr>
@@ -2345,7 +2345,7 @@
                 <w:proofErr w:type="spellStart"/>
                 <w:r>
                   <w:rPr>
-                    <w:rFonts w:ascii="Segoe UI Semibold" w:eastAsia="Times New Roman" w:hAnsi="Segoe UI Semibold" w:cs="Segoe UI Semibold"/>
+                    <w:rFonts w:ascii="Segoe UI Semibold" w:hAnsi="Segoe UI Semibold" w:eastAsia="Times New Roman" w:cs="Segoe UI Semibold"/>
                     <w:sz w:val="22"/>
                     <w:szCs w:val="22"/>
                   </w:rPr>
@@ -2360,8 +2360,8 @@
           <w:tcPr>
             <w:tcW w:w="960" w:type="dxa"/>
             <w:tcBorders>
-              <w:top w:val="single" w:sz="4" w:space="0" w:color="000000"/>
-              <w:bottom w:val="single" w:sz="12" w:space="0" w:color="000000"/>
+              <w:top w:val="single" w:color="000000" w:sz="4" w:space="0"/>
+              <w:bottom w:val="single" w:color="000000" w:sz="12" w:space="0"/>
             </w:tcBorders>
             <w:vAlign w:val="center"/>
           </w:tcPr>
@@ -2384,8 +2384,8 @@
           <w:tcPr>
             <w:tcW w:w="425" w:type="dxa"/>
             <w:tcBorders>
-              <w:top w:val="single" w:sz="4" w:space="0" w:color="000000"/>
-              <w:bottom w:val="single" w:sz="12" w:space="0" w:color="000000"/>
+              <w:top w:val="single" w:color="000000" w:sz="4" w:space="0"/>
+              <w:bottom w:val="single" w:color="000000" w:sz="12" w:space="0"/>
             </w:tcBorders>
             <w:vAlign w:val="center"/>
           </w:tcPr>
@@ -2408,8 +2408,8 @@
           <w:tcPr>
             <w:tcW w:w="429" w:type="dxa"/>
             <w:tcBorders>
-              <w:top w:val="single" w:sz="4" w:space="0" w:color="000000"/>
-              <w:bottom w:val="single" w:sz="12" w:space="0" w:color="000000"/>
+              <w:top w:val="single" w:color="000000" w:sz="4" w:space="0"/>
+              <w:bottom w:val="single" w:color="000000" w:sz="12" w:space="0"/>
             </w:tcBorders>
             <w:vAlign w:val="center"/>
           </w:tcPr>
@@ -2432,8 +2432,8 @@
           <w:tcPr>
             <w:tcW w:w="3685" w:type="dxa"/>
             <w:tcBorders>
-              <w:top w:val="single" w:sz="4" w:space="0" w:color="000000"/>
-              <w:bottom w:val="single" w:sz="12" w:space="0" w:color="000000"/>
+              <w:top w:val="single" w:color="000000" w:sz="4" w:space="0"/>
+              <w:bottom w:val="single" w:color="000000" w:sz="12" w:space="0"/>
             </w:tcBorders>
             <w:vAlign w:val="center"/>
           </w:tcPr>
@@ -2453,7 +2453,7 @@
             </w:pPr>
             <w:r>
               <w:rPr>
-                <w:rFonts w:ascii="Segoe UI Semibold" w:eastAsia="Times New Roman" w:hAnsi="Segoe UI Semibold" w:cs="Segoe UI Semibold"/>
+                <w:rFonts w:ascii="Segoe UI Semibold" w:hAnsi="Segoe UI Semibold" w:eastAsia="Times New Roman" w:cs="Segoe UI Semibold"/>
                 <w:sz w:val="22"/>
                 <w:szCs w:val="22"/>
               </w:rPr>
@@ -2463,7 +2463,7 @@
             <w:sdt>
               <w:sdtPr>
                 <w:rPr>
-                  <w:rFonts w:ascii="Segoe UI Semibold" w:eastAsia="Times New Roman" w:hAnsi="Segoe UI Semibold" w:cs="Segoe UI Semibold"/>
+                  <w:rFonts w:ascii="Segoe UI Semibold" w:hAnsi="Segoe UI Semibold" w:eastAsia="Times New Roman" w:cs="Segoe UI Semibold"/>
                   <w:sz w:val="22"/>
                   <w:szCs w:val="22"/>
                 </w:rPr>
@@ -2481,7 +2481,7 @@
               <w:sdtContent>
                 <w:r>
                   <w:rPr>
-                    <w:rFonts w:ascii="Segoe UI Semibold" w:eastAsia="Times New Roman" w:hAnsi="Segoe UI Semibold" w:cs="Segoe UI Semibold"/>
+                    <w:rFonts w:ascii="Segoe UI Semibold" w:hAnsi="Segoe UI Semibold" w:eastAsia="Times New Roman" w:cs="Segoe UI Semibold"/>
                     <w:sz w:val="22"/>
                     <w:szCs w:val="22"/>
                   </w:rPr>
@@ -4737,7 +4737,9 @@
  < / N a v W o r d R e p o r t X m l P a r t > 
 </file>
 
-<file path=customXml/item2.xml>��< ? x m l   v e r s i o n = " 1 . 0 "   e n c o d i n g = " u t f - 1 6 " ? > < N a v W o r d R e p o r t X m l P a r t   x m l n s = " u r n : m i c r o s o f t - d y n a m i c s - n a v / r e p o r t s / J o b _ Q u o t e / 1 0 1 6 / " > +<file path=customXml/item2.xml>��< ? x m l   v e r s i o n = " 1 . 0 "   e n c o d i n g = " u t f - 1 6 " ? > + 
+ < N a v W o r d R e p o r t X m l P a r t   x m l n s = " u r n : m i c r o s o f t - d y n a m i c s - n a v / r e p o r t s / J o b _ Q u o t e / 1 0 1 6 / " >   
      < B C R e p o r t I n f o r m a t i o n >   
@@ -4925,7 +4927,7 @@
  
          < C o m p a n y N a m e > C o m p a n y N a m e < / C o m p a n y N a m e >   
-         < C o m p a n y P i c t u r e / > +         < C o m p a n y P i c t u r e   / >   
          < C u r r R e p o r t P a g e N o C a p t i o n > C u r r R e p o r t P a g e N o C a p t i o n < / C u r r R e p o r t P a g e N o C a p t i o n >   

</xml_diff>

<commit_message>
Updated built and documents
</commit_message>
<xml_diff>
--- a/src/Layers/W1/BaseApp/Projects/Project/Reports/JobQuoteBody.docx
+++ b/src/Layers/W1/BaseApp/Projects/Project/Reports/JobQuoteBody.docx
@@ -7,12 +7,12 @@
         <w:tblStyle w:val="TableGrid"/>
         <w:tblW w:w="5000" w:type="pct"/>
         <w:tblBorders>
-          <w:top w:val="none" w:sz="0" w:space="0" w:color="auto"/>
-          <w:left w:val="none" w:sz="0" w:space="0" w:color="auto"/>
-          <w:bottom w:val="none" w:sz="0" w:space="0" w:color="auto"/>
-          <w:right w:val="none" w:sz="0" w:space="0" w:color="auto"/>
-          <w:insideH w:val="none" w:sz="0" w:space="0" w:color="auto"/>
-          <w:insideV w:val="none" w:sz="0" w:space="0" w:color="auto"/>
+          <w:top w:val="none" w:color="auto" w:sz="0" w:space="0"/>
+          <w:left w:val="none" w:color="auto" w:sz="0" w:space="0"/>
+          <w:bottom w:val="none" w:color="auto" w:sz="0" w:space="0"/>
+          <w:right w:val="none" w:color="auto" w:sz="0" w:space="0"/>
+          <w:insideH w:val="none" w:color="auto" w:sz="0" w:space="0"/>
+          <w:insideV w:val="none" w:color="auto" w:sz="0" w:space="0"/>
         </w:tblBorders>
         <w:tblCellMar>
           <w:left w:w="0" w:type="dxa"/>
@@ -192,14 +192,14 @@
               <w:p>
                 <w:pPr>
                   <w:rPr>
-                    <w:rFonts w:asciiTheme="minorHAnsi" w:hAnsiTheme="minorHAnsi" w:cs="Segoe UI Semibold"/>
+                    <w:rFonts w:cs="Segoe UI Semibold" w:asciiTheme="minorHAnsi" w:hAnsiTheme="minorHAnsi"/>
                     <w:sz w:val="22"/>
                     <w:szCs w:val="22"/>
                   </w:rPr>
                 </w:pPr>
                 <w:r>
                   <w:rPr>
-                    <w:rFonts w:asciiTheme="minorHAnsi" w:hAnsiTheme="minorHAnsi" w:cs="Segoe UI Semibold"/>
+                    <w:rFonts w:cs="Segoe UI Semibold" w:asciiTheme="minorHAnsi" w:hAnsiTheme="minorHAnsi"/>
                     <w:sz w:val="22"/>
                     <w:szCs w:val="22"/>
                   </w:rPr>
@@ -216,7 +216,7 @@
           <w:p>
             <w:pPr>
               <w:rPr>
-                <w:rFonts w:asciiTheme="minorHAnsi" w:hAnsiTheme="minorHAnsi" w:cs="Segoe UI Semibold"/>
+                <w:rFonts w:cs="Segoe UI Semibold" w:asciiTheme="minorHAnsi" w:hAnsiTheme="minorHAnsi"/>
                 <w:sz w:val="22"/>
                 <w:szCs w:val="22"/>
               </w:rPr>
@@ -250,14 +250,14 @@
                 <w:pPr>
                   <w:jc w:val="right"/>
                   <w:rPr>
-                    <w:rFonts w:asciiTheme="minorHAnsi" w:hAnsiTheme="minorHAnsi" w:cs="Segoe UI Semibold"/>
+                    <w:rFonts w:cs="Segoe UI Semibold" w:asciiTheme="minorHAnsi" w:hAnsiTheme="minorHAnsi"/>
                     <w:sz w:val="22"/>
                     <w:szCs w:val="22"/>
                   </w:rPr>
                 </w:pPr>
                 <w:r>
                   <w:rPr>
-                    <w:rFonts w:asciiTheme="minorHAnsi" w:hAnsiTheme="minorHAnsi" w:cs="Segoe UI Semibold"/>
+                    <w:rFonts w:cs="Segoe UI Semibold" w:asciiTheme="minorHAnsi" w:hAnsiTheme="minorHAnsi"/>
                     <w:sz w:val="22"/>
                     <w:szCs w:val="22"/>
                   </w:rPr>
@@ -298,14 +298,14 @@
               <w:p>
                 <w:pPr>
                   <w:rPr>
-                    <w:rFonts w:asciiTheme="minorHAnsi" w:hAnsiTheme="minorHAnsi" w:cs="Segoe UI Semibold"/>
+                    <w:rFonts w:cs="Segoe UI Semibold" w:asciiTheme="minorHAnsi" w:hAnsiTheme="minorHAnsi"/>
                     <w:sz w:val="22"/>
                     <w:szCs w:val="22"/>
                   </w:rPr>
                 </w:pPr>
                 <w:r>
                   <w:rPr>
-                    <w:rFonts w:asciiTheme="minorHAnsi" w:hAnsiTheme="minorHAnsi" w:cs="Segoe UI Semibold"/>
+                    <w:rFonts w:cs="Segoe UI Semibold" w:asciiTheme="minorHAnsi" w:hAnsiTheme="minorHAnsi"/>
                     <w:sz w:val="22"/>
                     <w:szCs w:val="22"/>
                   </w:rPr>
@@ -322,7 +322,7 @@
           <w:p>
             <w:pPr>
               <w:rPr>
-                <w:rFonts w:asciiTheme="minorHAnsi" w:hAnsiTheme="minorHAnsi" w:cs="Segoe UI Semibold"/>
+                <w:rFonts w:cs="Segoe UI Semibold" w:asciiTheme="minorHAnsi" w:hAnsiTheme="minorHAnsi"/>
                 <w:sz w:val="22"/>
                 <w:szCs w:val="22"/>
               </w:rPr>
@@ -356,14 +356,14 @@
                 <w:pPr>
                   <w:jc w:val="right"/>
                   <w:rPr>
-                    <w:rFonts w:asciiTheme="minorHAnsi" w:hAnsiTheme="minorHAnsi" w:cs="Segoe UI Semibold"/>
+                    <w:rFonts w:cs="Segoe UI Semibold" w:asciiTheme="minorHAnsi" w:hAnsiTheme="minorHAnsi"/>
                     <w:sz w:val="22"/>
                     <w:szCs w:val="22"/>
                   </w:rPr>
                 </w:pPr>
                 <w:r>
                   <w:rPr>
-                    <w:rFonts w:asciiTheme="minorHAnsi" w:hAnsiTheme="minorHAnsi" w:cs="Segoe UI Semibold"/>
+                    <w:rFonts w:cs="Segoe UI Semibold" w:asciiTheme="minorHAnsi" w:hAnsiTheme="minorHAnsi"/>
                     <w:sz w:val="22"/>
                     <w:szCs w:val="22"/>
                   </w:rPr>
@@ -404,14 +404,14 @@
               <w:p>
                 <w:pPr>
                   <w:rPr>
-                    <w:rFonts w:asciiTheme="minorHAnsi" w:hAnsiTheme="minorHAnsi" w:cs="Segoe UI Semibold"/>
+                    <w:rFonts w:cs="Segoe UI Semibold" w:asciiTheme="minorHAnsi" w:hAnsiTheme="minorHAnsi"/>
                     <w:sz w:val="22"/>
                     <w:szCs w:val="22"/>
                   </w:rPr>
                 </w:pPr>
                 <w:r>
                   <w:rPr>
-                    <w:rFonts w:asciiTheme="minorHAnsi" w:hAnsiTheme="minorHAnsi" w:cs="Segoe UI Semibold"/>
+                    <w:rFonts w:cs="Segoe UI Semibold" w:asciiTheme="minorHAnsi" w:hAnsiTheme="minorHAnsi"/>
                     <w:sz w:val="22"/>
                     <w:szCs w:val="22"/>
                   </w:rPr>
@@ -428,7 +428,7 @@
           <w:p>
             <w:pPr>
               <w:rPr>
-                <w:rFonts w:asciiTheme="minorHAnsi" w:hAnsiTheme="minorHAnsi" w:cs="Segoe UI Semibold"/>
+                <w:rFonts w:cs="Segoe UI Semibold" w:asciiTheme="minorHAnsi" w:hAnsiTheme="minorHAnsi"/>
                 <w:sz w:val="22"/>
                 <w:szCs w:val="22"/>
               </w:rPr>
@@ -443,7 +443,7 @@
             <w:pPr>
               <w:jc w:val="right"/>
               <w:rPr>
-                <w:rFonts w:asciiTheme="minorHAnsi" w:hAnsiTheme="minorHAnsi" w:cs="Segoe UI Semibold"/>
+                <w:rFonts w:cs="Segoe UI Semibold" w:asciiTheme="minorHAnsi" w:hAnsiTheme="minorHAnsi"/>
                 <w:sz w:val="22"/>
                 <w:szCs w:val="22"/>
               </w:rPr>
@@ -469,7 +469,7 @@
               <w:sdtContent>
                 <w:r>
                   <w:rPr>
-                    <w:rFonts w:asciiTheme="minorHAnsi" w:hAnsiTheme="minorHAnsi" w:cs="Segoe UI Semibold"/>
+                    <w:rFonts w:cs="Segoe UI Semibold" w:asciiTheme="minorHAnsi" w:hAnsiTheme="minorHAnsi"/>
                     <w:sz w:val="22"/>
                     <w:szCs w:val="22"/>
                   </w:rPr>
@@ -510,14 +510,14 @@
               <w:p>
                 <w:pPr>
                   <w:rPr>
-                    <w:rFonts w:asciiTheme="minorHAnsi" w:hAnsiTheme="minorHAnsi" w:cs="Segoe UI Semibold"/>
+                    <w:rFonts w:cs="Segoe UI Semibold" w:asciiTheme="minorHAnsi" w:hAnsiTheme="minorHAnsi"/>
                     <w:sz w:val="22"/>
                     <w:szCs w:val="22"/>
                   </w:rPr>
                 </w:pPr>
                 <w:r>
                   <w:rPr>
-                    <w:rFonts w:asciiTheme="minorHAnsi" w:hAnsiTheme="minorHAnsi" w:cs="Segoe UI Semibold"/>
+                    <w:rFonts w:cs="Segoe UI Semibold" w:asciiTheme="minorHAnsi" w:hAnsiTheme="minorHAnsi"/>
                     <w:sz w:val="22"/>
                     <w:szCs w:val="22"/>
                   </w:rPr>
@@ -534,7 +534,7 @@
           <w:p>
             <w:pPr>
               <w:rPr>
-                <w:rFonts w:asciiTheme="minorHAnsi" w:hAnsiTheme="minorHAnsi" w:cs="Segoe UI Semibold"/>
+                <w:rFonts w:cs="Segoe UI Semibold" w:asciiTheme="minorHAnsi" w:hAnsiTheme="minorHAnsi"/>
                 <w:sz w:val="22"/>
                 <w:szCs w:val="22"/>
               </w:rPr>
@@ -549,7 +549,7 @@
             <w:pPr>
               <w:jc w:val="right"/>
               <w:rPr>
-                <w:rFonts w:asciiTheme="minorHAnsi" w:hAnsiTheme="minorHAnsi" w:cs="Segoe UI Semibold"/>
+                <w:rFonts w:cs="Segoe UI Semibold" w:asciiTheme="minorHAnsi" w:hAnsiTheme="minorHAnsi"/>
                 <w:sz w:val="22"/>
                 <w:szCs w:val="22"/>
               </w:rPr>
@@ -575,7 +575,7 @@
               <w:sdtContent>
                 <w:r>
                   <w:rPr>
-                    <w:rFonts w:asciiTheme="minorHAnsi" w:hAnsiTheme="minorHAnsi" w:cs="Segoe UI Semibold"/>
+                    <w:rFonts w:cs="Segoe UI Semibold" w:asciiTheme="minorHAnsi" w:hAnsiTheme="minorHAnsi"/>
                     <w:sz w:val="22"/>
                     <w:szCs w:val="22"/>
                   </w:rPr>
@@ -616,14 +616,14 @@
               <w:p>
                 <w:pPr>
                   <w:rPr>
-                    <w:rFonts w:asciiTheme="minorHAnsi" w:hAnsiTheme="minorHAnsi" w:cs="Segoe UI Semibold"/>
+                    <w:rFonts w:cs="Segoe UI Semibold" w:asciiTheme="minorHAnsi" w:hAnsiTheme="minorHAnsi"/>
                     <w:sz w:val="22"/>
                     <w:szCs w:val="22"/>
                   </w:rPr>
                 </w:pPr>
                 <w:r>
                   <w:rPr>
-                    <w:rFonts w:asciiTheme="minorHAnsi" w:hAnsiTheme="minorHAnsi" w:cs="Segoe UI Semibold"/>
+                    <w:rFonts w:cs="Segoe UI Semibold" w:asciiTheme="minorHAnsi" w:hAnsiTheme="minorHAnsi"/>
                     <w:sz w:val="22"/>
                     <w:szCs w:val="22"/>
                   </w:rPr>
@@ -640,7 +640,7 @@
           <w:p>
             <w:pPr>
               <w:rPr>
-                <w:rFonts w:asciiTheme="minorHAnsi" w:hAnsiTheme="minorHAnsi" w:cs="Segoe UI Semibold"/>
+                <w:rFonts w:cs="Segoe UI Semibold" w:asciiTheme="minorHAnsi" w:hAnsiTheme="minorHAnsi"/>
                 <w:sz w:val="22"/>
                 <w:szCs w:val="22"/>
               </w:rPr>
@@ -674,14 +674,14 @@
                 <w:pPr>
                   <w:jc w:val="right"/>
                   <w:rPr>
-                    <w:rFonts w:asciiTheme="minorHAnsi" w:hAnsiTheme="minorHAnsi" w:cs="Segoe UI Semibold"/>
+                    <w:rFonts w:cs="Segoe UI Semibold" w:asciiTheme="minorHAnsi" w:hAnsiTheme="minorHAnsi"/>
                     <w:sz w:val="22"/>
                     <w:szCs w:val="22"/>
                   </w:rPr>
                 </w:pPr>
                 <w:r>
                   <w:rPr>
-                    <w:rFonts w:asciiTheme="minorHAnsi" w:hAnsiTheme="minorHAnsi" w:cs="Segoe UI Semibold"/>
+                    <w:rFonts w:cs="Segoe UI Semibold" w:asciiTheme="minorHAnsi" w:hAnsiTheme="minorHAnsi"/>
                     <w:sz w:val="22"/>
                     <w:szCs w:val="22"/>
                   </w:rPr>
@@ -703,12 +703,12 @@
         <w:tblStyle w:val="TableGrid"/>
         <w:tblW w:w="5000" w:type="pct"/>
         <w:tblBorders>
-          <w:top w:val="none" w:sz="0" w:space="0" w:color="auto"/>
-          <w:left w:val="none" w:sz="0" w:space="0" w:color="auto"/>
-          <w:bottom w:val="none" w:sz="0" w:space="0" w:color="auto"/>
-          <w:right w:val="none" w:sz="0" w:space="0" w:color="auto"/>
-          <w:insideH w:val="none" w:sz="0" w:space="0" w:color="auto"/>
-          <w:insideV w:val="none" w:sz="0" w:space="0" w:color="auto"/>
+          <w:top w:val="none" w:color="auto" w:sz="0" w:space="0"/>
+          <w:left w:val="none" w:color="auto" w:sz="0" w:space="0"/>
+          <w:bottom w:val="none" w:color="auto" w:sz="0" w:space="0"/>
+          <w:right w:val="none" w:color="auto" w:sz="0" w:space="0"/>
+          <w:insideH w:val="none" w:color="auto" w:sz="0" w:space="0"/>
+          <w:insideV w:val="none" w:color="auto" w:sz="0" w:space="0"/>
         </w:tblBorders>
         <w:tblCellMar>
           <w:left w:w="0" w:type="dxa"/>
@@ -792,7 +792,7 @@
                 <w:proofErr w:type="spellStart"/>
                 <w:r>
                   <w:rPr>
-                    <w:rFonts w:asciiTheme="minorHAnsi" w:hAnsiTheme="minorHAnsi" w:cs="Segoe UI Semibold"/>
+                    <w:rFonts w:cs="Segoe UI Semibold" w:asciiTheme="minorHAnsi" w:hAnsiTheme="minorHAnsi"/>
                     <w:sz w:val="22"/>
                     <w:szCs w:val="22"/>
                   </w:rPr>
@@ -810,12 +810,12 @@
         <w:tblStyle w:val="TableGrid"/>
         <w:tblW w:w="5000" w:type="pct"/>
         <w:tblBorders>
-          <w:top w:val="none" w:sz="0" w:space="0" w:color="auto"/>
-          <w:left w:val="none" w:sz="0" w:space="0" w:color="auto"/>
-          <w:bottom w:val="none" w:sz="0" w:space="0" w:color="auto"/>
-          <w:right w:val="none" w:sz="0" w:space="0" w:color="auto"/>
-          <w:insideH w:val="none" w:sz="0" w:space="0" w:color="auto"/>
-          <w:insideV w:val="none" w:sz="0" w:space="0" w:color="auto"/>
+          <w:top w:val="none" w:color="auto" w:sz="0" w:space="0"/>
+          <w:left w:val="none" w:color="auto" w:sz="0" w:space="0"/>
+          <w:bottom w:val="none" w:color="auto" w:sz="0" w:space="0"/>
+          <w:right w:val="none" w:color="auto" w:sz="0" w:space="0"/>
+          <w:insideH w:val="none" w:color="auto" w:sz="0" w:space="0"/>
+          <w:insideV w:val="none" w:color="auto" w:sz="0" w:space="0"/>
         </w:tblBorders>
         <w:tblLayout w:type="fixed"/>
         <w:tblCellMar>
@@ -1034,7 +1034,7 @@
               <w:p>
                 <w:pPr>
                   <w:rPr>
-                    <w:rFonts w:asciiTheme="minorHAnsi" w:hAnsiTheme="minorHAnsi" w:cs="Segoe UI"/>
+                    <w:rFonts w:cs="Segoe UI" w:asciiTheme="minorHAnsi" w:hAnsiTheme="minorHAnsi"/>
                     <w:color w:val="242424"/>
                     <w:sz w:val="22"/>
                     <w:szCs w:val="22"/>
@@ -1042,7 +1042,7 @@
                 </w:pPr>
                 <w:r>
                   <w:rPr>
-                    <w:rFonts w:asciiTheme="minorHAnsi" w:hAnsiTheme="minorHAnsi" w:cs="Segoe UI"/>
+                    <w:rFonts w:cs="Segoe UI" w:asciiTheme="minorHAnsi" w:hAnsiTheme="minorHAnsi"/>
                     <w:color w:val="242424"/>
                     <w:sz w:val="22"/>
                     <w:szCs w:val="22"/>
@@ -1120,7 +1120,7 @@
         <w:sdt>
           <w:sdtPr>
             <w:rPr>
-              <w:rFonts w:ascii="Segoe UI Semibold" w:eastAsiaTheme="minorHAnsi" w:hAnsi="Segoe UI Semibold" w:cs="Segoe UI Semibold"/>
+              <w:rFonts w:ascii="Segoe UI Semibold" w:hAnsi="Segoe UI Semibold" w:cs="Segoe UI Semibold" w:eastAsiaTheme="minorHAnsi"/>
               <w:sz w:val="18"/>
               <w:szCs w:val="18"/>
             </w:rPr>
@@ -1141,21 +1141,21 @@
                 <w:cnfStyle w:val="001000000000" w:firstRow="0" w:lastRow="0" w:firstColumn="1" w:lastColumn="0" w:oddVBand="0" w:evenVBand="0" w:oddHBand="0" w:evenHBand="0" w:firstRowFirstColumn="0" w:firstRowLastColumn="0" w:lastRowFirstColumn="0" w:lastRowLastColumn="0"/>
                 <w:tcW w:w="515" w:type="pct"/>
                 <w:tcBorders>
-                  <w:bottom w:val="single" w:sz="4" w:space="0" w:color="auto"/>
+                  <w:bottom w:val="single" w:color="auto" w:sz="4" w:space="0"/>
                 </w:tcBorders>
               </w:tcPr>
               <w:p>
                 <w:pPr>
                   <w:pStyle w:val="Heading2"/>
                   <w:rPr>
-                    <w:rFonts w:ascii="Segoe UI Semibold" w:eastAsiaTheme="minorHAnsi" w:hAnsi="Segoe UI Semibold" w:cs="Segoe UI Semibold"/>
+                    <w:rFonts w:ascii="Segoe UI Semibold" w:hAnsi="Segoe UI Semibold" w:cs="Segoe UI Semibold" w:eastAsiaTheme="minorHAnsi"/>
                     <w:sz w:val="18"/>
                     <w:szCs w:val="18"/>
                   </w:rPr>
                 </w:pPr>
                 <w:r>
                   <w:rPr>
-                    <w:rFonts w:ascii="Segoe UI Semibold" w:eastAsiaTheme="minorHAnsi" w:hAnsi="Segoe UI Semibold" w:cs="Segoe UI Semibold"/>
+                    <w:rFonts w:ascii="Segoe UI Semibold" w:hAnsi="Segoe UI Semibold" w:cs="Segoe UI Semibold" w:eastAsiaTheme="minorHAnsi"/>
                     <w:sz w:val="18"/>
                     <w:szCs w:val="18"/>
                   </w:rPr>
@@ -1188,7 +1188,7 @@
               <w:tcPr>
                 <w:tcW w:w="901" w:type="pct"/>
                 <w:tcBorders>
-                  <w:bottom w:val="single" w:sz="4" w:space="0" w:color="auto"/>
+                  <w:bottom w:val="single" w:color="auto" w:sz="4" w:space="0"/>
                 </w:tcBorders>
               </w:tcPr>
               <w:p>
@@ -1236,7 +1236,7 @@
               <w:tcPr>
                 <w:tcW w:w="557" w:type="pct"/>
                 <w:tcBorders>
-                  <w:bottom w:val="single" w:sz="4" w:space="0" w:color="auto"/>
+                  <w:bottom w:val="single" w:color="auto" w:sz="4" w:space="0"/>
                 </w:tcBorders>
               </w:tcPr>
               <w:p>
@@ -1284,7 +1284,7 @@
               <w:tcPr>
                 <w:tcW w:w="429" w:type="pct"/>
                 <w:tcBorders>
-                  <w:bottom w:val="single" w:sz="4" w:space="0" w:color="auto"/>
+                  <w:bottom w:val="single" w:color="auto" w:sz="4" w:space="0"/>
                 </w:tcBorders>
               </w:tcPr>
               <w:p>
@@ -1332,7 +1332,7 @@
               <w:tcPr>
                 <w:tcW w:w="472" w:type="pct"/>
                 <w:tcBorders>
-                  <w:bottom w:val="single" w:sz="4" w:space="0" w:color="auto"/>
+                  <w:bottom w:val="single" w:color="auto" w:sz="4" w:space="0"/>
                 </w:tcBorders>
               </w:tcPr>
               <w:p>
@@ -1381,7 +1381,7 @@
               <w:tcPr>
                 <w:tcW w:w="557" w:type="pct"/>
                 <w:tcBorders>
-                  <w:bottom w:val="single" w:sz="4" w:space="0" w:color="auto"/>
+                  <w:bottom w:val="single" w:color="auto" w:sz="4" w:space="0"/>
                 </w:tcBorders>
               </w:tcPr>
               <w:p>
@@ -1430,7 +1430,7 @@
               <w:tcPr>
                 <w:tcW w:w="515" w:type="pct"/>
                 <w:tcBorders>
-                  <w:bottom w:val="single" w:sz="4" w:space="0" w:color="auto"/>
+                  <w:bottom w:val="single" w:color="auto" w:sz="4" w:space="0"/>
                 </w:tcBorders>
               </w:tcPr>
               <w:p>
@@ -1479,7 +1479,7 @@
               <w:tcPr>
                 <w:tcW w:w="515" w:type="pct"/>
                 <w:tcBorders>
-                  <w:bottom w:val="single" w:sz="4" w:space="0" w:color="auto"/>
+                  <w:bottom w:val="single" w:color="auto" w:sz="4" w:space="0"/>
                 </w:tcBorders>
               </w:tcPr>
               <w:p>
@@ -1528,7 +1528,7 @@
               <w:tcPr>
                 <w:tcW w:w="540" w:type="pct"/>
                 <w:tcBorders>
-                  <w:bottom w:val="single" w:sz="4" w:space="0" w:color="auto"/>
+                  <w:bottom w:val="single" w:color="auto" w:sz="4" w:space="0"/>
                 </w:tcBorders>
               </w:tcPr>
               <w:p>
@@ -1558,14 +1558,14 @@
       <w:tr>
         <w:trPr>
           <w:cnfStyle w:val="000000100000" w:firstRow="0" w:lastRow="0" w:firstColumn="0" w:lastColumn="0" w:oddVBand="0" w:evenVBand="0" w:oddHBand="1" w:evenHBand="0" w:firstRowFirstColumn="0" w:firstRowLastColumn="0" w:lastRowFirstColumn="0" w:lastRowLastColumn="0"/>
-          <w:trHeight w:hRule="exact" w:val="245"/>
+          <w:trHeight w:val="245" w:hRule="exact"/>
         </w:trPr>
         <w:tc>
           <w:tcPr>
             <w:cnfStyle w:val="001000000000" w:firstRow="0" w:lastRow="0" w:firstColumn="1" w:lastColumn="0" w:oddVBand="0" w:evenVBand="0" w:oddHBand="0" w:evenHBand="0" w:firstRowFirstColumn="0" w:firstRowLastColumn="0" w:lastRowFirstColumn="0" w:lastRowLastColumn="0"/>
             <w:tcW w:w="515" w:type="pct"/>
             <w:tcBorders>
-              <w:top w:val="single" w:sz="4" w:space="0" w:color="auto"/>
+              <w:top w:val="single" w:color="auto" w:sz="4" w:space="0"/>
             </w:tcBorders>
           </w:tcPr>
           <w:p>
@@ -1584,7 +1584,7 @@
           <w:tcPr>
             <w:tcW w:w="901" w:type="pct"/>
             <w:tcBorders>
-              <w:top w:val="single" w:sz="4" w:space="0" w:color="auto"/>
+              <w:top w:val="single" w:color="auto" w:sz="4" w:space="0"/>
             </w:tcBorders>
           </w:tcPr>
           <w:p>
@@ -1605,7 +1605,7 @@
           <w:tcPr>
             <w:tcW w:w="557" w:type="pct"/>
             <w:tcBorders>
-              <w:top w:val="single" w:sz="4" w:space="0" w:color="auto"/>
+              <w:top w:val="single" w:color="auto" w:sz="4" w:space="0"/>
             </w:tcBorders>
           </w:tcPr>
           <w:p>
@@ -1626,7 +1626,7 @@
           <w:tcPr>
             <w:tcW w:w="429" w:type="pct"/>
             <w:tcBorders>
-              <w:top w:val="single" w:sz="4" w:space="0" w:color="auto"/>
+              <w:top w:val="single" w:color="auto" w:sz="4" w:space="0"/>
             </w:tcBorders>
           </w:tcPr>
           <w:p>
@@ -1647,7 +1647,7 @@
           <w:tcPr>
             <w:tcW w:w="472" w:type="pct"/>
             <w:tcBorders>
-              <w:top w:val="single" w:sz="4" w:space="0" w:color="auto"/>
+              <w:top w:val="single" w:color="auto" w:sz="4" w:space="0"/>
             </w:tcBorders>
           </w:tcPr>
           <w:p>
@@ -1669,7 +1669,7 @@
           <w:tcPr>
             <w:tcW w:w="557" w:type="pct"/>
             <w:tcBorders>
-              <w:top w:val="single" w:sz="4" w:space="0" w:color="auto"/>
+              <w:top w:val="single" w:color="auto" w:sz="4" w:space="0"/>
             </w:tcBorders>
           </w:tcPr>
           <w:p>
@@ -1690,7 +1690,7 @@
           <w:tcPr>
             <w:tcW w:w="515" w:type="pct"/>
             <w:tcBorders>
-              <w:top w:val="single" w:sz="4" w:space="0" w:color="auto"/>
+              <w:top w:val="single" w:color="auto" w:sz="4" w:space="0"/>
             </w:tcBorders>
           </w:tcPr>
           <w:p>
@@ -1711,7 +1711,7 @@
           <w:tcPr>
             <w:tcW w:w="515" w:type="pct"/>
             <w:tcBorders>
-              <w:top w:val="single" w:sz="4" w:space="0" w:color="auto"/>
+              <w:top w:val="single" w:color="auto" w:sz="4" w:space="0"/>
             </w:tcBorders>
           </w:tcPr>
           <w:p>
@@ -1732,7 +1732,7 @@
           <w:tcPr>
             <w:tcW w:w="540" w:type="pct"/>
             <w:tcBorders>
-              <w:top w:val="single" w:sz="4" w:space="0" w:color="auto"/>
+              <w:top w:val="single" w:color="auto" w:sz="4" w:space="0"/>
             </w:tcBorders>
           </w:tcPr>
           <w:p>
@@ -1753,7 +1753,7 @@
       <w:sdt>
         <w:sdtPr>
           <w:rPr>
-            <w:rFonts w:asciiTheme="minorHAnsi" w:eastAsiaTheme="minorEastAsia" w:hAnsiTheme="minorHAnsi" w:cs="Segoe UI"/>
+            <w:rFonts w:cs="Segoe UI" w:asciiTheme="minorHAnsi" w:hAnsiTheme="minorHAnsi" w:eastAsiaTheme="minorEastAsia"/>
             <w:bCs w:val="0"/>
             <w:kern w:val="2"/>
             <w:sz w:val="18"/>
@@ -1772,7 +1772,7 @@
           <w:sdt>
             <w:sdtPr>
               <w:rPr>
-                <w:rFonts w:asciiTheme="minorHAnsi" w:eastAsiaTheme="minorEastAsia" w:hAnsiTheme="minorHAnsi" w:cs="Segoe UI"/>
+                <w:rFonts w:cs="Segoe UI" w:asciiTheme="minorHAnsi" w:hAnsiTheme="minorHAnsi" w:eastAsiaTheme="minorEastAsia"/>
                 <w:bCs w:val="0"/>
                 <w:kern w:val="2"/>
                 <w:sz w:val="18"/>
@@ -1788,7 +1788,7 @@
               <w:sdt>
                 <w:sdtPr>
                   <w:rPr>
-                    <w:rFonts w:asciiTheme="minorHAnsi" w:eastAsiaTheme="minorEastAsia" w:hAnsiTheme="minorHAnsi" w:cs="Segoe UI"/>
+                    <w:rFonts w:cs="Segoe UI" w:asciiTheme="minorHAnsi" w:hAnsiTheme="minorHAnsi" w:eastAsiaTheme="minorEastAsia"/>
                     <w:bCs w:val="0"/>
                     <w:kern w:val="2"/>
                     <w:sz w:val="18"/>
@@ -1807,7 +1807,7 @@
                   <w:sdt>
                     <w:sdtPr>
                       <w:rPr>
-                        <w:rFonts w:asciiTheme="minorHAnsi" w:eastAsiaTheme="minorEastAsia" w:hAnsiTheme="minorHAnsi" w:cs="Segoe UI"/>
+                        <w:rFonts w:cs="Segoe UI" w:asciiTheme="minorHAnsi" w:hAnsiTheme="minorHAnsi" w:eastAsiaTheme="minorEastAsia"/>
                         <w:bCs w:val="0"/>
                         <w:kern w:val="2"/>
                         <w:sz w:val="18"/>
@@ -1828,7 +1828,7 @@
                         <w:sdt>
                           <w:sdtPr>
                             <w:rPr>
-                              <w:rFonts w:asciiTheme="minorHAnsi" w:eastAsiaTheme="minorEastAsia" w:hAnsiTheme="minorHAnsi" w:cs="Segoe UI"/>
+                              <w:rFonts w:cs="Segoe UI" w:asciiTheme="minorHAnsi" w:hAnsiTheme="minorHAnsi" w:eastAsiaTheme="minorEastAsia"/>
                               <w:bCs w:val="0"/>
                               <w:kern w:val="2"/>
                               <w:sz w:val="18"/>
@@ -1848,7 +1848,7 @@
                           </w:sdtPr>
                           <w:sdtEndPr>
                             <w:rPr>
-                              <w:rFonts w:ascii="Segoe UI" w:eastAsia="Aptos" w:hAnsi="Segoe UI" w:cs="Segoe UI Semibold"/>
+                              <w:rFonts w:ascii="Segoe UI" w:hAnsi="Segoe UI" w:eastAsia="Aptos" w:cs="Segoe UI Semibold"/>
                               <w:bCs/>
                               <w:kern w:val="0"/>
                               <w:lang w:val="da-DK" w:eastAsia="da-DK"/>
@@ -1865,7 +1865,7 @@
                               <w:p>
                                 <w:pPr>
                                   <w:rPr>
-                                    <w:rFonts w:asciiTheme="minorHAnsi" w:hAnsiTheme="minorHAnsi" w:cs="Segoe UI Semibold"/>
+                                    <w:rFonts w:cs="Segoe UI Semibold" w:asciiTheme="minorHAnsi" w:hAnsiTheme="minorHAnsi"/>
                                     <w:sz w:val="18"/>
                                     <w:szCs w:val="18"/>
                                     <w:lang w:val="en-US" w:eastAsia="en-US"/>
@@ -1873,7 +1873,7 @@
                                 </w:pPr>
                                 <w:r>
                                   <w:rPr>
-                                    <w:rFonts w:asciiTheme="minorHAnsi" w:hAnsiTheme="minorHAnsi" w:cs="Segoe UI Semibold"/>
+                                    <w:rFonts w:cs="Segoe UI Semibold" w:asciiTheme="minorHAnsi" w:hAnsiTheme="minorHAnsi"/>
                                     <w:sz w:val="18"/>
                                     <w:szCs w:val="18"/>
                                     <w:lang w:val="en-US" w:eastAsia="en-US"/>
@@ -1912,7 +1912,7 @@
                                 <w:pPr>
                                   <w:cnfStyle w:val="000000010000" w:firstRow="0" w:lastRow="0" w:firstColumn="0" w:lastColumn="0" w:oddVBand="0" w:evenVBand="0" w:oddHBand="0" w:evenHBand="1" w:firstRowFirstColumn="0" w:firstRowLastColumn="0" w:lastRowFirstColumn="0" w:lastRowLastColumn="0"/>
                                   <w:rPr>
-                                    <w:rFonts w:asciiTheme="minorHAnsi" w:hAnsiTheme="minorHAnsi" w:cs="Segoe UI Semibold"/>
+                                    <w:rFonts w:cs="Segoe UI Semibold" w:asciiTheme="minorHAnsi" w:hAnsiTheme="minorHAnsi"/>
                                     <w:sz w:val="18"/>
                                     <w:szCs w:val="18"/>
                                     <w:lang w:eastAsia="en-US"/>
@@ -1920,7 +1920,7 @@
                                 </w:pPr>
                                 <w:r>
                                   <w:rPr>
-                                    <w:rFonts w:asciiTheme="minorHAnsi" w:hAnsiTheme="minorHAnsi" w:cs="Segoe UI Semibold"/>
+                                    <w:rFonts w:cs="Segoe UI Semibold" w:asciiTheme="minorHAnsi" w:hAnsiTheme="minorHAnsi"/>
                                     <w:sz w:val="18"/>
                                     <w:szCs w:val="18"/>
                                     <w:lang w:eastAsia="en-US"/>
@@ -1959,7 +1959,7 @@
                                 <w:pPr>
                                   <w:cnfStyle w:val="000000010000" w:firstRow="0" w:lastRow="0" w:firstColumn="0" w:lastColumn="0" w:oddVBand="0" w:evenVBand="0" w:oddHBand="0" w:evenHBand="1" w:firstRowFirstColumn="0" w:firstRowLastColumn="0" w:lastRowFirstColumn="0" w:lastRowLastColumn="0"/>
                                   <w:rPr>
-                                    <w:rFonts w:asciiTheme="minorHAnsi" w:hAnsiTheme="minorHAnsi" w:cs="Segoe UI Semibold"/>
+                                    <w:rFonts w:cs="Segoe UI Semibold" w:asciiTheme="minorHAnsi" w:hAnsiTheme="minorHAnsi"/>
                                     <w:sz w:val="18"/>
                                     <w:szCs w:val="18"/>
                                     <w:lang w:val="en-US" w:eastAsia="en-US"/>
@@ -1967,7 +1967,7 @@
                                 </w:pPr>
                                 <w:r>
                                   <w:rPr>
-                                    <w:rFonts w:asciiTheme="minorHAnsi" w:hAnsiTheme="minorHAnsi" w:cs="Segoe UI Semibold"/>
+                                    <w:rFonts w:cs="Segoe UI Semibold" w:asciiTheme="minorHAnsi" w:hAnsiTheme="minorHAnsi"/>
                                     <w:sz w:val="18"/>
                                     <w:szCs w:val="18"/>
                                     <w:lang w:val="en-US" w:eastAsia="en-US"/>
@@ -2006,14 +2006,14 @@
                                 <w:pPr>
                                   <w:cnfStyle w:val="000000010000" w:firstRow="0" w:lastRow="0" w:firstColumn="0" w:lastColumn="0" w:oddVBand="0" w:evenVBand="0" w:oddHBand="0" w:evenHBand="1" w:firstRowFirstColumn="0" w:firstRowLastColumn="0" w:lastRowFirstColumn="0" w:lastRowLastColumn="0"/>
                                   <w:rPr>
-                                    <w:rFonts w:asciiTheme="minorHAnsi" w:hAnsiTheme="minorHAnsi" w:cs="Segoe UI Semibold"/>
+                                    <w:rFonts w:cs="Segoe UI Semibold" w:asciiTheme="minorHAnsi" w:hAnsiTheme="minorHAnsi"/>
                                     <w:sz w:val="18"/>
                                     <w:szCs w:val="18"/>
                                   </w:rPr>
                                 </w:pPr>
                                 <w:r>
                                   <w:rPr>
-                                    <w:rFonts w:asciiTheme="minorHAnsi" w:hAnsiTheme="minorHAnsi" w:cs="Segoe UI Semibold"/>
+                                    <w:rFonts w:cs="Segoe UI Semibold" w:asciiTheme="minorHAnsi" w:hAnsiTheme="minorHAnsi"/>
                                     <w:sz w:val="18"/>
                                     <w:szCs w:val="18"/>
                                   </w:rPr>
@@ -2052,14 +2052,14 @@
                                   <w:jc w:val="right"/>
                                   <w:cnfStyle w:val="000000010000" w:firstRow="0" w:lastRow="0" w:firstColumn="0" w:lastColumn="0" w:oddVBand="0" w:evenVBand="0" w:oddHBand="0" w:evenHBand="1" w:firstRowFirstColumn="0" w:firstRowLastColumn="0" w:lastRowFirstColumn="0" w:lastRowLastColumn="0"/>
                                   <w:rPr>
-                                    <w:rFonts w:asciiTheme="minorHAnsi" w:hAnsiTheme="minorHAnsi" w:cs="Segoe UI Semibold"/>
+                                    <w:rFonts w:cs="Segoe UI Semibold" w:asciiTheme="minorHAnsi" w:hAnsiTheme="minorHAnsi"/>
                                     <w:sz w:val="18"/>
                                     <w:szCs w:val="18"/>
                                   </w:rPr>
                                 </w:pPr>
                                 <w:r>
                                   <w:rPr>
-                                    <w:rFonts w:asciiTheme="minorHAnsi" w:hAnsiTheme="minorHAnsi" w:cs="Segoe UI Semibold"/>
+                                    <w:rFonts w:cs="Segoe UI Semibold" w:asciiTheme="minorHAnsi" w:hAnsiTheme="minorHAnsi"/>
                                     <w:sz w:val="18"/>
                                     <w:szCs w:val="18"/>
                                   </w:rPr>
@@ -2142,7 +2142,7 @@
                                   <w:pStyle w:val="CLNumBase"/>
                                   <w:cnfStyle w:val="000000010000" w:firstRow="0" w:lastRow="0" w:firstColumn="0" w:lastColumn="0" w:oddVBand="0" w:evenVBand="0" w:oddHBand="0" w:evenHBand="1" w:firstRowFirstColumn="0" w:firstRowLastColumn="0" w:lastRowFirstColumn="0" w:lastRowLastColumn="0"/>
                                   <w:rPr>
-                                    <w:rFonts w:asciiTheme="minorHAnsi" w:hAnsiTheme="minorHAnsi" w:cs="Segoe UI Semibold"/>
+                                    <w:rFonts w:cs="Segoe UI Semibold" w:asciiTheme="minorHAnsi" w:hAnsiTheme="minorHAnsi"/>
                                     <w:sz w:val="18"/>
                                     <w:szCs w:val="18"/>
                                   </w:rPr>
@@ -2233,14 +2233,14 @@
                                   <w:jc w:val="right"/>
                                   <w:cnfStyle w:val="000000010000" w:firstRow="0" w:lastRow="0" w:firstColumn="0" w:lastColumn="0" w:oddVBand="0" w:evenVBand="0" w:oddHBand="0" w:evenHBand="1" w:firstRowFirstColumn="0" w:firstRowLastColumn="0" w:lastRowFirstColumn="0" w:lastRowLastColumn="0"/>
                                   <w:rPr>
-                                    <w:rFonts w:asciiTheme="minorHAnsi" w:hAnsiTheme="minorHAnsi" w:cs="Segoe UI Semibold"/>
+                                    <w:rFonts w:cs="Segoe UI Semibold" w:asciiTheme="minorHAnsi" w:hAnsiTheme="minorHAnsi"/>
                                     <w:sz w:val="18"/>
                                     <w:szCs w:val="18"/>
                                   </w:rPr>
                                 </w:pPr>
                                 <w:r>
                                   <w:rPr>
-                                    <w:rFonts w:asciiTheme="minorHAnsi" w:hAnsiTheme="minorHAnsi" w:cs="Segoe UI Semibold"/>
+                                    <w:rFonts w:cs="Segoe UI Semibold" w:asciiTheme="minorHAnsi" w:hAnsiTheme="minorHAnsi"/>
                                     <w:sz w:val="18"/>
                                     <w:szCs w:val="18"/>
                                   </w:rPr>
@@ -2289,7 +2289,7 @@
         <w:sdt>
           <w:sdtPr>
             <w:rPr>
-              <w:rFonts w:ascii="Segoe UI Semibold" w:eastAsia="Times New Roman" w:hAnsi="Segoe UI Semibold" w:cs="Segoe UI Semibold"/>
+              <w:rFonts w:ascii="Segoe UI Semibold" w:hAnsi="Segoe UI Semibold" w:eastAsia="Times New Roman" w:cs="Segoe UI Semibold"/>
               <w:sz w:val="18"/>
               <w:szCs w:val="18"/>
             </w:rPr>
@@ -2310,8 +2310,8 @@
                 <w:cnfStyle w:val="001000000000" w:firstRow="0" w:lastRow="0" w:firstColumn="1" w:lastColumn="0" w:oddVBand="0" w:evenVBand="0" w:oddHBand="0" w:evenHBand="0" w:firstRowFirstColumn="0" w:firstRowLastColumn="0" w:lastRowFirstColumn="0" w:lastRowLastColumn="0"/>
                 <w:tcW w:w="2131" w:type="pct"/>
                 <w:tcBorders>
-                  <w:top w:val="single" w:sz="4" w:space="0" w:color="000000"/>
-                  <w:bottom w:val="single" w:sz="12" w:space="0" w:color="000000"/>
+                  <w:top w:val="single" w:color="000000" w:sz="4" w:space="0"/>
+                  <w:bottom w:val="single" w:color="000000" w:sz="12" w:space="0"/>
                 </w:tcBorders>
                 <w:vAlign w:val="center"/>
               </w:tcPr>
@@ -2320,14 +2320,14 @@
                   <w:pStyle w:val="Heading2"/>
                   <w:spacing w:before="120" w:after="120" w:line="240" w:lineRule="exact"/>
                   <w:rPr>
-                    <w:rFonts w:ascii="Segoe UI Semibold" w:eastAsia="Times New Roman" w:hAnsi="Segoe UI Semibold" w:cs="Segoe UI Semibold"/>
+                    <w:rFonts w:ascii="Segoe UI Semibold" w:hAnsi="Segoe UI Semibold" w:eastAsia="Times New Roman" w:cs="Segoe UI Semibold"/>
                     <w:sz w:val="18"/>
                     <w:szCs w:val="18"/>
                   </w:rPr>
                 </w:pPr>
                 <w:r>
                   <w:rPr>
-                    <w:rFonts w:ascii="Segoe UI Semibold" w:eastAsia="Times New Roman" w:hAnsi="Segoe UI Semibold" w:cs="Segoe UI Semibold"/>
+                    <w:rFonts w:ascii="Segoe UI Semibold" w:hAnsi="Segoe UI Semibold" w:eastAsia="Times New Roman" w:cs="Segoe UI Semibold"/>
                     <w:sz w:val="18"/>
                     <w:szCs w:val="18"/>
                   </w:rPr>
@@ -2341,8 +2341,8 @@
           <w:tcPr>
             <w:tcW w:w="253" w:type="pct"/>
             <w:tcBorders>
-              <w:top w:val="single" w:sz="4" w:space="0" w:color="000000"/>
-              <w:bottom w:val="single" w:sz="12" w:space="0" w:color="000000"/>
+              <w:top w:val="single" w:color="000000" w:sz="4" w:space="0"/>
+              <w:bottom w:val="single" w:color="000000" w:sz="12" w:space="0"/>
             </w:tcBorders>
             <w:vAlign w:val="center"/>
           </w:tcPr>
@@ -2365,8 +2365,8 @@
           <w:tcPr>
             <w:tcW w:w="842" w:type="pct"/>
             <w:tcBorders>
-              <w:top w:val="single" w:sz="4" w:space="0" w:color="000000"/>
-              <w:bottom w:val="single" w:sz="12" w:space="0" w:color="000000"/>
+              <w:top w:val="single" w:color="000000" w:sz="4" w:space="0"/>
+              <w:bottom w:val="single" w:color="000000" w:sz="12" w:space="0"/>
             </w:tcBorders>
             <w:vAlign w:val="center"/>
           </w:tcPr>
@@ -2389,8 +2389,8 @@
           <w:tcPr>
             <w:tcW w:w="1319" w:type="pct"/>
             <w:tcBorders>
-              <w:top w:val="single" w:sz="4" w:space="0" w:color="000000"/>
-              <w:bottom w:val="single" w:sz="12" w:space="0" w:color="000000"/>
+              <w:top w:val="single" w:color="000000" w:sz="4" w:space="0"/>
+              <w:bottom w:val="single" w:color="000000" w:sz="12" w:space="0"/>
             </w:tcBorders>
             <w:vAlign w:val="center"/>
           </w:tcPr>
@@ -2413,8 +2413,8 @@
           <w:tcPr>
             <w:tcW w:w="455" w:type="pct"/>
             <w:tcBorders>
-              <w:top w:val="single" w:sz="4" w:space="0" w:color="000000"/>
-              <w:bottom w:val="single" w:sz="12" w:space="0" w:color="000000"/>
+              <w:top w:val="single" w:color="000000" w:sz="4" w:space="0"/>
+              <w:bottom w:val="single" w:color="000000" w:sz="12" w:space="0"/>
             </w:tcBorders>
             <w:vAlign w:val="center"/>
           </w:tcPr>
@@ -2434,7 +2434,7 @@
             </w:pPr>
             <w:r>
               <w:rPr>
-                <w:rFonts w:ascii="Segoe UI Semibold" w:eastAsia="Times New Roman" w:hAnsi="Segoe UI Semibold" w:cs="Segoe UI Semibold"/>
+                <w:rFonts w:ascii="Segoe UI Semibold" w:hAnsi="Segoe UI Semibold" w:eastAsia="Times New Roman" w:cs="Segoe UI Semibold"/>
                 <w:sz w:val="18"/>
                 <w:szCs w:val="18"/>
               </w:rPr>
@@ -2443,7 +2443,7 @@
             <w:sdt>
               <w:sdtPr>
                 <w:rPr>
-                  <w:rFonts w:ascii="Segoe UI Semibold" w:eastAsia="Times New Roman" w:hAnsi="Segoe UI Semibold" w:cs="Segoe UI Semibold"/>
+                  <w:rFonts w:ascii="Segoe UI Semibold" w:hAnsi="Segoe UI Semibold" w:eastAsia="Times New Roman" w:cs="Segoe UI Semibold"/>
                   <w:sz w:val="18"/>
                   <w:szCs w:val="18"/>
                 </w:rPr>
@@ -2461,7 +2461,7 @@
               <w:sdtContent>
                 <w:r>
                   <w:rPr>
-                    <w:rFonts w:ascii="Segoe UI Semibold" w:eastAsia="Times New Roman" w:hAnsi="Segoe UI Semibold" w:cs="Segoe UI Semibold"/>
+                    <w:rFonts w:ascii="Segoe UI Semibold" w:hAnsi="Segoe UI Semibold" w:eastAsia="Times New Roman" w:cs="Segoe UI Semibold"/>
                     <w:sz w:val="18"/>
                     <w:szCs w:val="18"/>
                   </w:rPr>
@@ -4771,7 +4771,9 @@
  < / N a v W o r d R e p o r t X m l P a r t > 
 </file>
 
-<file path=customXml/item2.xml>��< ? x m l   v e r s i o n = " 1 . 0 "   e n c o d i n g = " u t f - 1 6 " ? > < N a v W o r d R e p o r t X m l P a r t   x m l n s = " u r n : m i c r o s o f t - d y n a m i c s - n a v / r e p o r t s / J o b _ Q u o t e / 1 0 1 6 / " > +<file path=customXml/item2.xml>��< ? x m l   v e r s i o n = " 1 . 0 "   e n c o d i n g = " u t f - 1 6 " ? > + 
+ < N a v W o r d R e p o r t X m l P a r t   x m l n s = " u r n : m i c r o s o f t - d y n a m i c s - n a v / r e p o r t s / J o b _ Q u o t e / 1 0 1 6 / " >   
      < B C R e p o r t I n f o r m a t i o n >   
@@ -4959,7 +4961,7 @@
  
          < C o m p a n y N a m e > C o m p a n y N a m e < / C o m p a n y N a m e >   
-         < C o m p a n y P i c t u r e / > +         < C o m p a n y P i c t u r e   / >   
          < C u r r R e p o r t P a g e N o C a p t i o n > C u r r R e p o r t P a g e N o C a p t i o n < / C u r r R e p o r t P a g e N o C a p t i o n >   

</xml_diff>